<commit_message>
Specify preform imports (Oman/UAE to Ethiopia) in tax exemption letter
Co-Authored-By: Claude Sonnet 5.5 <noreply@anthropic.com>
Claude-Session: https://claude.ai/code/session_01EqJk32uwxCc6dvDCC1jLei
</commit_message>
<xml_diff>
--- a/docs/canshuur_dhaaf_codsi.docx
+++ b/docs/canshuur_dhaaf_codsi.docx
@@ -724,7 +724,7 @@
           <w:sz w:val="24"/>
           <w:szCs w:val="24"/>
         </w:rPr>
-        <w:t xml:space="preserve">Anagoo ah maamulka Al-Naciim Water Company, waxaan si xushmad iyo qadarin leh ugu soo gudbinaynaa Wasaaradda Maaliyadda Dowladda Puntland codsi ku saabsan in shirkaddayada loo sameeyo canshuur-dhaaf ku meel gaar ah, inta ay jiraan duruufaha adag ee hadda saameeyay hawlaha dalabka iyo soo-dejinta alaabta shirkaddu u baahan tahay.</w:t>
+        <w:t xml:space="preserve">Anagoo ah maamulka Al-Naciim Water Company, waxaan si xushmad iyo qadarin leh ugu soo gudbinaynaa Wasaaradda Maaliyadda Dowladda Puntland codsi ku saabsan in shirkaddayada loo sameeyo canshuur-dhaaf ku meel gaar ah, inta ay jiraan duruufaha adag ee hadda saameeyay soo-dejinta preform-ka (alaabta ceyriinka ah ee dhalooyinka biyaha) ee shirkaddu u baahan tahay.</w:t>
       </w:r>
     </w:p>
     <w:p>
@@ -758,7 +758,7 @@
           <w:sz w:val="24"/>
           <w:szCs w:val="24"/>
         </w:rPr>
-        <w:t xml:space="preserve">Dhawaan, dalabyadii shirkaddu hore uga helaysay dalalka Oman iyo UAE way dib u dhaceen, sababo la xiriira caqabadaha ka jira marinka badda ee Hormuz. Xaaladdan awgeed, shirkaddu waxay ku qasbanaatay inay adeegga iyo alaabta looga baahan yahay ka dalbato dalka Ethiopia, kaas oo qiimihiisu aad u sarreeyo, waqtiga gaarsiintuna sii dheeraanayo. Tani waxay kordhisay kharashka hawlgalka, waxaana sii kordhay culayska canshuurta dheeraadka ah.</w:t>
+        <w:t xml:space="preserve">Hore, shirkaddu waxay preform-ka ka gadan jirtay dalalka Oman iyo UAE. Hadda, sababo la xiriira caqabadaha ka jira marinka badda ee Hormuz, dalabyadii dalalkaas way dib u dhaceen, shirkadduna waxay ku qasbanaatay inay preform-ka ka dalbato dalka Ethiopia, kaas oo qiimihiisu aad uga sarreeyo, waqtiga gaarsiintuna sii dheeraanayo. Tani waxay kordhisay kharashka hawlgalka, waxaana sii kordhay culayska canshuurta dheeraadka ah.</w:t>
       </w:r>
     </w:p>
     <w:p>
@@ -775,7 +775,7 @@
           <w:sz w:val="24"/>
           <w:szCs w:val="24"/>
         </w:rPr>
-        <w:t xml:space="preserve">Sidaa darteed, waxaan si xushmad leh uga codsanaynaa Wasaaradda Maaliyadda Dowladda Puntland inay shirkadda u sameyso canshuur-dhaaf inta duruufahan jiraan, ilaa marinka Hormuz iyo dalabyada Oman iyo UAE ay ku soo noqdaan xaalad caadi ah, iyadoo la raacayo xeerarka iyo nidaamyada maaliyadeed ee Dowladda Puntland.</w:t>
+        <w:t xml:space="preserve">Sidaa darteed, waxaan si xushmad leh uga codsanaynaa Wasaaradda Maaliyadda Dowladda Puntland inay shirkadda u sameyso canshuur-dhaaf inta duruufahan jiraan, ilaa marinka Hormuz iyo soo-dejinta preform-ka ee Oman iyo UAE ay ku soo noqdaan xaalad caadi ah, iyadoo la raacayo xeerarka iyo nidaamyada maaliyadeed ee Dowladda Puntland.</w:t>
       </w:r>
     </w:p>
     <w:p>

</xml_diff>